<commit_message>
paper: move abstract and keywords into the two-column region
Co-Authored-By: Claude Opus 5.5 <noreply@anthropic.com>
Claude-Session: https://claude.ai/code/session_012DnZnKWSp8hpn2ZCsUuFme
</commit_message>
<xml_diff>
--- a/paper/SecureScanRV_Paper2.docx
+++ b/paper/SecureScanRV_Paper2.docx
@@ -231,6 +231,16 @@
     </w:tbl>
     <w:p>
       <w:pPr>
+        <w:sectPr>
+          <w:pgSz w:w="12240" w:h="15840" w:orient="portrait"/>
+          <w:pgMar w:top="1080" w:right="1080" w:bottom="1080" w:left="1080" w:header="708" w:footer="708" w:gutter="0"/>
+          <w:pgNumType/>
+          <w:docGrid w:linePitch="360"/>
+        </w:sectPr>
+      </w:pPr>
+    </w:p>
+    <w:p>
+      <w:pPr>
         <w:spacing w:after="40" w:before="160"/>
         <w:ind w:firstLine="220"/>
         <w:jc w:val="both"/>
@@ -306,16 +316,6 @@
         </w:rPr>
         <w:t xml:space="preserve">scan chain security; design for testability; AES-128; RISC-V coprocessor; secure scan lock; hardware security; FPGA.</w:t>
       </w:r>
-    </w:p>
-    <w:p>
-      <w:pPr>
-        <w:sectPr>
-          <w:pgSz w:w="12240" w:h="15840" w:orient="portrait"/>
-          <w:pgMar w:top="1080" w:right="1080" w:bottom="1080" w:left="1080" w:header="708" w:footer="708" w:gutter="0"/>
-          <w:pgNumType/>
-          <w:docGrid w:linePitch="360"/>
-        </w:sectPr>
-      </w:pPr>
     </w:p>
     <w:p>
       <w:pPr>

</xml_diff>

<commit_message>
board: add hardware photographs to report, paper, and docs
- paper/figures/board/board1..6.jpg: Boolean Board photos (locked red / unlocked
  green; 7-seg shows ciphertext low word)
- Report Ch 11.5 'Board photographs': 5 titled figures incl. the decisive
  G1 (90C5DFD7, attack) vs G4 (70B4C55A, blocked) pair, both locked
- IEEE paper Results: Figure 6 (G1 attack) and Figure 7 (G4 blocked)
- PAPER_REFERENCE s9: photo list and captions

Co-Authored-By: Claude Opus 5.5 <noreply@anthropic.com>
Claude-Session: https://claude.ai/code/session_012DnZnKWSp8hpn2ZCsUuFme
</commit_message>
<xml_diff>
--- a/paper/SecureScanRV_Paper2.docx
+++ b/paper/SecureScanRV_Paper2.docx
@@ -5647,6 +5647,126 @@
           <w:szCs w:val="20"/>
         </w:rPr>
         <w:t xml:space="preserve">The complete design was exercised on hardware through a serial console, and four demonstrations were captured. A known answer encryption returned the standard ciphertext, and an unlocked scan read exposed the key, the final round key, and the ciphertext; after relocking, the scan read returned all zeros. On the Paper 1 variant an injection while locked changed the ciphertext, confirming the write attack, while on the write blocking variant the identical injection returned the true known answer, confirming the block. A machine checked proof further established, by induction over all inputs, that the scan output of the write blocking lock is held at zero whenever the device is locked, giving a formal basis for the read confidentiality property.</w:t>
+      </w:r>
+    </w:p>
+    <w:p>
+      <w:pPr>
+        <w:spacing w:after="20" w:before="120"/>
+        <w:jc w:val="center"/>
+      </w:pPr>
+      <w:r>
+        <w:drawing>
+          <wp:inline distT="0" distB="0" distL="0" distR="0">
+            <wp:extent cx="3067050" cy="2295525"/>
+            <wp:effectExtent t="0" r="0" b="0" l="0"/>
+            <wp:docPr id="6" name="" descr="" title=""/>
+            <wp:cNvGraphicFramePr>
+              <a:graphicFrameLocks xmlns:a="http://schemas.openxmlformats.org/drawingml/2006/main" noChangeAspect="1"/>
+            </wp:cNvGraphicFramePr>
+            <a:graphic xmlns:a="http://schemas.openxmlformats.org/drawingml/2006/main">
+              <a:graphicData uri="http://schemas.openxmlformats.org/drawingml/2006/picture">
+                <pic:pic xmlns:pic="http://schemas.openxmlformats.org/drawingml/2006/picture">
+                  <pic:nvPicPr>
+                    <pic:cNvPr id="0" name="" descr=""/>
+                    <pic:cNvPicPr>
+                      <a:picLocks noChangeAspect="1" noChangeArrowheads="1"/>
+                    </pic:cNvPicPr>
+                  </pic:nvPicPr>
+                  <pic:blipFill>
+                    <a:blip r:embed="rId12" cstate="none"/>
+                    <a:srcRect/>
+                    <a:stretch>
+                      <a:fillRect/>
+                    </a:stretch>
+                  </pic:blipFill>
+                  <pic:spPr bwMode="auto">
+                    <a:xfrm>
+                      <a:off x="0" y="0"/>
+                      <a:ext cx="3067050" cy="2295525"/>
+                    </a:xfrm>
+                    <a:prstGeom prst="rect">
+                      <a:avLst/>
+                    </a:prstGeom>
+                  </pic:spPr>
+                </pic:pic>
+              </a:graphicData>
+            </a:graphic>
+          </wp:inline>
+        </w:drawing>
+      </w:r>
+    </w:p>
+    <w:p>
+      <w:pPr>
+        <w:spacing w:after="160" w:before="60"/>
+        <w:jc w:val="center"/>
+      </w:pPr>
+      <w:r>
+        <w:rPr>
+          <w:rFonts w:ascii="Times New Roman" w:cs="Times New Roman" w:eastAsia="Times New Roman" w:hAnsi="Times New Roman"/>
+          <w:sz w:val="18"/>
+          <w:szCs w:val="18"/>
+        </w:rPr>
+        <w:t xml:space="preserve">Figure 6.  Paper 1 lock, locked: a scan-injected key makes the seven-segment display read 90C5DFD7, the attacker ciphertext word. The write attack succeeds.</w:t>
+      </w:r>
+    </w:p>
+    <w:p>
+      <w:pPr>
+        <w:spacing w:after="20" w:before="120"/>
+        <w:jc w:val="center"/>
+      </w:pPr>
+      <w:r>
+        <w:drawing>
+          <wp:inline distT="0" distB="0" distL="0" distR="0">
+            <wp:extent cx="3067050" cy="2295525"/>
+            <wp:effectExtent t="0" r="0" b="0" l="0"/>
+            <wp:docPr id="7" name="" descr="" title=""/>
+            <wp:cNvGraphicFramePr>
+              <a:graphicFrameLocks xmlns:a="http://schemas.openxmlformats.org/drawingml/2006/main" noChangeAspect="1"/>
+            </wp:cNvGraphicFramePr>
+            <a:graphic xmlns:a="http://schemas.openxmlformats.org/drawingml/2006/main">
+              <a:graphicData uri="http://schemas.openxmlformats.org/drawingml/2006/picture">
+                <pic:pic xmlns:pic="http://schemas.openxmlformats.org/drawingml/2006/picture">
+                  <pic:nvPicPr>
+                    <pic:cNvPr id="0" name="" descr=""/>
+                    <pic:cNvPicPr>
+                      <a:picLocks noChangeAspect="1" noChangeArrowheads="1"/>
+                    </pic:cNvPicPr>
+                  </pic:nvPicPr>
+                  <pic:blipFill>
+                    <a:blip r:embed="rId13" cstate="none"/>
+                    <a:srcRect/>
+                    <a:stretch>
+                      <a:fillRect/>
+                    </a:stretch>
+                  </pic:blipFill>
+                  <pic:spPr bwMode="auto">
+                    <a:xfrm>
+                      <a:off x="0" y="0"/>
+                      <a:ext cx="3067050" cy="2295525"/>
+                    </a:xfrm>
+                    <a:prstGeom prst="rect">
+                      <a:avLst/>
+                    </a:prstGeom>
+                  </pic:spPr>
+                </pic:pic>
+              </a:graphicData>
+            </a:graphic>
+          </wp:inline>
+        </w:drawing>
+      </w:r>
+    </w:p>
+    <w:p>
+      <w:pPr>
+        <w:spacing w:after="160" w:before="60"/>
+        <w:jc w:val="center"/>
+      </w:pPr>
+      <w:r>
+        <w:rPr>
+          <w:rFonts w:ascii="Times New Roman" w:cs="Times New Roman" w:eastAsia="Times New Roman" w:hAnsi="Times New Roman"/>
+          <w:sz w:val="18"/>
+          <w:szCs w:val="18"/>
+        </w:rPr>
+        <w:t xml:space="preserve">Figure 7.  Write-blocking lock, locked: the identical injection leaves the display at 70B4C55A, the true known-answer word. The write attack is blocked.</w:t>
       </w:r>
     </w:p>
     <w:p>

</xml_diff>